<commit_message>
Update CV and Env Variables
</commit_message>
<xml_diff>
--- a/public/CV Peter Bardenhagen.docx
+++ b/public/CV Peter Bardenhagen.docx
@@ -1237,29 +1237,7 @@
                 <w:sz w:val="16"/>
                 <w:szCs w:val="16"/>
               </w:rPr>
-              <w:t xml:space="preserve">Capgemini </w:t>
-            </w:r>
-            <w:proofErr w:type="gramStart"/>
-            <w:r>
-              <w:rPr>
-                <w:rFonts w:ascii="Aptos Narrow" w:hAnsi="Aptos Narrow" w:cstheme="minorHAnsi"/>
-                <w:bCs/>
-                <w:color w:val="000000" w:themeColor="text1"/>
-                <w:sz w:val="16"/>
-                <w:szCs w:val="16"/>
-              </w:rPr>
-              <w:t>Lead</w:t>
-            </w:r>
-            <w:proofErr w:type="gramEnd"/>
-            <w:r>
-              <w:rPr>
-                <w:rFonts w:ascii="Aptos Narrow" w:hAnsi="Aptos Narrow" w:cstheme="minorHAnsi"/>
-                <w:bCs/>
-                <w:color w:val="000000" w:themeColor="text1"/>
-                <w:sz w:val="16"/>
-                <w:szCs w:val="16"/>
-              </w:rPr>
-              <w:t xml:space="preserve"> Architect</w:t>
+              <w:t>Capgemini Lead Architect</w:t>
             </w:r>
           </w:p>
         </w:tc>
@@ -1525,7 +1503,6 @@
                 <w:szCs w:val="16"/>
               </w:rPr>
             </w:pPr>
-            <w:proofErr w:type="spellStart"/>
             <w:r>
               <w:rPr>
                 <w:rFonts w:ascii="Aptos Narrow" w:hAnsi="Aptos Narrow" w:cstheme="minorHAnsi"/>
@@ -1534,18 +1511,7 @@
                 <w:sz w:val="16"/>
                 <w:szCs w:val="16"/>
               </w:rPr>
-              <w:t>SAFe</w:t>
-            </w:r>
-            <w:proofErr w:type="spellEnd"/>
-            <w:r>
-              <w:rPr>
-                <w:rFonts w:ascii="Aptos Narrow" w:hAnsi="Aptos Narrow" w:cstheme="minorHAnsi"/>
-                <w:bCs/>
-                <w:color w:val="000000" w:themeColor="text1"/>
-                <w:sz w:val="16"/>
-                <w:szCs w:val="16"/>
-              </w:rPr>
-              <w:t xml:space="preserve"> Agilist 5.0</w:t>
+              <w:t>SAFe Agilist 5.0</w:t>
             </w:r>
           </w:p>
         </w:tc>
@@ -2216,7 +2182,6 @@
               </w:rPr>
               <w:t xml:space="preserve">, </w:t>
             </w:r>
-            <w:proofErr w:type="spellStart"/>
             <w:r>
               <w:rPr>
                 <w:rFonts w:ascii="Aptos Narrow" w:hAnsi="Aptos Narrow" w:cstheme="minorHAnsi"/>
@@ -2225,18 +2190,7 @@
                 <w:sz w:val="12"/>
                 <w:szCs w:val="12"/>
               </w:rPr>
-              <w:t>PowerBI</w:t>
-            </w:r>
-            <w:proofErr w:type="spellEnd"/>
-            <w:r>
-              <w:rPr>
-                <w:rFonts w:ascii="Aptos Narrow" w:hAnsi="Aptos Narrow" w:cstheme="minorHAnsi"/>
-                <w:bCs/>
-                <w:color w:val="000000" w:themeColor="text1"/>
-                <w:sz w:val="12"/>
-                <w:szCs w:val="12"/>
-              </w:rPr>
-              <w:t xml:space="preserve">, </w:t>
+              <w:t xml:space="preserve">PowerBI, </w:t>
             </w:r>
             <w:r>
               <w:rPr>
@@ -2355,6 +2309,413 @@
     </w:p>
     <w:p>
       <w:pPr>
+        <w:pStyle w:val="PlainText"/>
+        <w:spacing w:after="200" w:line="276" w:lineRule="auto"/>
+        <w:contextualSpacing/>
+        <w:rPr>
+          <w:rFonts w:ascii="Aptos Narrow" w:eastAsia="MS Mincho" w:hAnsi="Aptos Narrow" w:cs="Arial"/>
+          <w:b/>
+          <w:bCs/>
+          <w:sz w:val="18"/>
+          <w:szCs w:val="18"/>
+        </w:rPr>
+      </w:pPr>
+      <w:r>
+        <w:rPr>
+          <w:rFonts w:ascii="Aptos Narrow" w:eastAsia="MS Mincho" w:hAnsi="Aptos Narrow" w:cs="Arial"/>
+          <w:b/>
+          <w:bCs/>
+          <w:sz w:val="18"/>
+          <w:szCs w:val="18"/>
+        </w:rPr>
+        <w:t>Solution Architect</w:t>
+      </w:r>
+    </w:p>
+    <w:p>
+      <w:pPr>
+        <w:pStyle w:val="PlainText"/>
+        <w:spacing w:after="200" w:line="276" w:lineRule="auto"/>
+        <w:contextualSpacing/>
+        <w:rPr>
+          <w:rFonts w:ascii="Aptos Narrow" w:hAnsi="Aptos Narrow" w:cs="Arial"/>
+          <w:i/>
+          <w:iCs/>
+          <w:color w:val="000000" w:themeColor="text1"/>
+          <w:sz w:val="18"/>
+          <w:szCs w:val="18"/>
+        </w:rPr>
+      </w:pPr>
+      <w:r>
+        <w:rPr>
+          <w:rFonts w:ascii="Aptos Narrow" w:eastAsia="MS Mincho" w:hAnsi="Aptos Narrow" w:cs="Arial"/>
+          <w:b/>
+          <w:bCs/>
+          <w:sz w:val="18"/>
+          <w:szCs w:val="18"/>
+        </w:rPr>
+        <w:t xml:space="preserve">Recusant </w:t>
+      </w:r>
+      <w:r>
+        <w:rPr>
+          <w:rFonts w:ascii="Aptos Narrow" w:eastAsia="MS Mincho" w:hAnsi="Aptos Narrow" w:cs="Arial"/>
+          <w:sz w:val="18"/>
+          <w:szCs w:val="18"/>
+        </w:rPr>
+        <w:t>–</w:t>
+      </w:r>
+      <w:r>
+        <w:rPr>
+          <w:rFonts w:ascii="Aptos Narrow" w:eastAsia="MS Mincho" w:hAnsi="Aptos Narrow" w:cs="Arial"/>
+          <w:sz w:val="18"/>
+          <w:szCs w:val="18"/>
+        </w:rPr>
+        <w:t xml:space="preserve"> Brisbane</w:t>
+      </w:r>
+      <w:r>
+        <w:rPr>
+          <w:rFonts w:ascii="Aptos Narrow" w:eastAsia="MS Mincho" w:hAnsi="Aptos Narrow" w:cs="Arial"/>
+          <w:sz w:val="18"/>
+          <w:szCs w:val="18"/>
+        </w:rPr>
+        <w:br/>
+      </w:r>
+      <w:r>
+        <w:rPr>
+          <w:rFonts w:ascii="Aptos Narrow" w:hAnsi="Aptos Narrow" w:cs="Arial"/>
+          <w:i/>
+          <w:iCs/>
+          <w:color w:val="000000" w:themeColor="text1"/>
+          <w:sz w:val="18"/>
+          <w:szCs w:val="18"/>
+        </w:rPr>
+        <w:t>March</w:t>
+      </w:r>
+      <w:r>
+        <w:rPr>
+          <w:rFonts w:ascii="Aptos Narrow" w:hAnsi="Aptos Narrow" w:cs="Arial"/>
+          <w:i/>
+          <w:iCs/>
+          <w:color w:val="000000" w:themeColor="text1"/>
+          <w:sz w:val="18"/>
+          <w:szCs w:val="18"/>
+        </w:rPr>
+        <w:t xml:space="preserve"> 2024 – Present</w:t>
+      </w:r>
+    </w:p>
+    <w:p>
+      <w:pPr>
+        <w:pStyle w:val="PlainText"/>
+        <w:spacing w:after="200" w:line="276" w:lineRule="auto"/>
+        <w:contextualSpacing/>
+        <w:rPr>
+          <w:rFonts w:ascii="Aptos Narrow" w:hAnsi="Aptos Narrow" w:cs="Arial"/>
+          <w:color w:val="000000" w:themeColor="text1"/>
+          <w:sz w:val="18"/>
+          <w:szCs w:val="18"/>
+        </w:rPr>
+      </w:pPr>
+      <w:r>
+        <w:rPr>
+          <w:rFonts w:ascii="Aptos Narrow" w:hAnsi="Aptos Narrow" w:cs="Arial"/>
+          <w:b/>
+          <w:bCs/>
+          <w:color w:val="000000" w:themeColor="text1"/>
+          <w:sz w:val="18"/>
+          <w:szCs w:val="18"/>
+        </w:rPr>
+        <w:t>Overview</w:t>
+      </w:r>
+      <w:r>
+        <w:rPr>
+          <w:rFonts w:ascii="Aptos Narrow" w:hAnsi="Aptos Narrow" w:cs="Arial"/>
+          <w:color w:val="000000" w:themeColor="text1"/>
+          <w:sz w:val="18"/>
+          <w:szCs w:val="18"/>
+        </w:rPr>
+        <w:t>:</w:t>
+      </w:r>
+      <w:r>
+        <w:rPr>
+          <w:rFonts w:ascii="Aptos Narrow" w:hAnsi="Aptos Narrow" w:cs="Arial"/>
+          <w:color w:val="000000" w:themeColor="text1"/>
+          <w:sz w:val="18"/>
+          <w:szCs w:val="18"/>
+        </w:rPr>
+        <w:t xml:space="preserve"> </w:t>
+      </w:r>
+      <w:r>
+        <w:rPr>
+          <w:rFonts w:ascii="Aptos Narrow" w:hAnsi="Aptos Narrow" w:cs="Arial"/>
+          <w:color w:val="000000" w:themeColor="text1"/>
+          <w:sz w:val="18"/>
+          <w:szCs w:val="18"/>
+        </w:rPr>
+        <w:t>Engaged in short-term contracts while pursuing opportunities for longer-term roles.</w:t>
+      </w:r>
+      <w:r>
+        <w:rPr>
+          <w:rFonts w:ascii="Aptos Narrow" w:hAnsi="Aptos Narrow" w:cs="Arial"/>
+          <w:color w:val="000000" w:themeColor="text1"/>
+          <w:sz w:val="18"/>
+          <w:szCs w:val="18"/>
+        </w:rPr>
+        <w:br/>
+      </w:r>
+      <w:r>
+        <w:rPr>
+          <w:rFonts w:ascii="Aptos Narrow" w:hAnsi="Aptos Narrow" w:cs="Arial"/>
+          <w:b/>
+          <w:bCs/>
+          <w:color w:val="000000" w:themeColor="text1"/>
+          <w:sz w:val="18"/>
+          <w:szCs w:val="18"/>
+        </w:rPr>
+        <w:t>Responsibilities</w:t>
+      </w:r>
+      <w:r>
+        <w:rPr>
+          <w:rFonts w:ascii="Aptos Narrow" w:hAnsi="Aptos Narrow" w:cs="Arial"/>
+          <w:color w:val="000000" w:themeColor="text1"/>
+          <w:sz w:val="18"/>
+          <w:szCs w:val="18"/>
+        </w:rPr>
+        <w:t>:</w:t>
+      </w:r>
+    </w:p>
+    <w:p>
+      <w:pPr>
+        <w:pStyle w:val="PlainText"/>
+        <w:numPr>
+          <w:ilvl w:val="0"/>
+          <w:numId w:val="36"/>
+        </w:numPr>
+        <w:spacing w:after="200" w:line="276" w:lineRule="auto"/>
+        <w:contextualSpacing/>
+        <w:rPr>
+          <w:rFonts w:ascii="Aptos Narrow" w:hAnsi="Aptos Narrow" w:cs="Arial"/>
+          <w:color w:val="000000" w:themeColor="text1"/>
+          <w:sz w:val="18"/>
+          <w:szCs w:val="18"/>
+        </w:rPr>
+      </w:pPr>
+      <w:r>
+        <w:rPr>
+          <w:rFonts w:ascii="Aptos Narrow" w:hAnsi="Aptos Narrow" w:cs="Arial"/>
+          <w:color w:val="000000" w:themeColor="text1"/>
+          <w:sz w:val="18"/>
+          <w:szCs w:val="18"/>
+        </w:rPr>
+        <w:t>Lead the architecture and delivery of innovative, AI-driven information management solutions tailored to enterprise clients.</w:t>
+      </w:r>
+    </w:p>
+    <w:p>
+      <w:pPr>
+        <w:pStyle w:val="PlainText"/>
+        <w:numPr>
+          <w:ilvl w:val="0"/>
+          <w:numId w:val="36"/>
+        </w:numPr>
+        <w:spacing w:after="200" w:line="276" w:lineRule="auto"/>
+        <w:contextualSpacing/>
+        <w:rPr>
+          <w:rFonts w:ascii="Aptos Narrow" w:hAnsi="Aptos Narrow" w:cs="Arial"/>
+          <w:color w:val="000000" w:themeColor="text1"/>
+          <w:sz w:val="18"/>
+          <w:szCs w:val="18"/>
+        </w:rPr>
+      </w:pPr>
+      <w:r>
+        <w:rPr>
+          <w:rFonts w:ascii="Aptos Narrow" w:hAnsi="Aptos Narrow" w:cs="Arial"/>
+          <w:color w:val="000000" w:themeColor="text1"/>
+          <w:sz w:val="18"/>
+          <w:szCs w:val="18"/>
+        </w:rPr>
+        <w:t>Provide strategic architectural governance, ensuring alignment between technical implementations and client business objectives.</w:t>
+      </w:r>
+    </w:p>
+    <w:p>
+      <w:pPr>
+        <w:pStyle w:val="PlainText"/>
+        <w:numPr>
+          <w:ilvl w:val="0"/>
+          <w:numId w:val="36"/>
+        </w:numPr>
+        <w:spacing w:after="200" w:line="276" w:lineRule="auto"/>
+        <w:contextualSpacing/>
+        <w:rPr>
+          <w:rFonts w:ascii="Aptos Narrow" w:hAnsi="Aptos Narrow" w:cs="Arial"/>
+          <w:color w:val="000000" w:themeColor="text1"/>
+          <w:sz w:val="18"/>
+          <w:szCs w:val="18"/>
+        </w:rPr>
+      </w:pPr>
+      <w:r>
+        <w:rPr>
+          <w:rFonts w:ascii="Aptos Narrow" w:hAnsi="Aptos Narrow" w:cs="Arial"/>
+          <w:color w:val="000000" w:themeColor="text1"/>
+          <w:sz w:val="18"/>
+          <w:szCs w:val="18"/>
+        </w:rPr>
+        <w:t>Manage and mentor cross-functional development teams, ensuring high-quality, scalable, and secure software delivery.</w:t>
+      </w:r>
+    </w:p>
+    <w:p>
+      <w:pPr>
+        <w:pStyle w:val="PlainText"/>
+        <w:numPr>
+          <w:ilvl w:val="0"/>
+          <w:numId w:val="36"/>
+        </w:numPr>
+        <w:spacing w:after="200" w:line="276" w:lineRule="auto"/>
+        <w:contextualSpacing/>
+        <w:rPr>
+          <w:rFonts w:ascii="Aptos Narrow" w:hAnsi="Aptos Narrow" w:cs="Arial"/>
+          <w:color w:val="000000" w:themeColor="text1"/>
+          <w:sz w:val="18"/>
+          <w:szCs w:val="18"/>
+        </w:rPr>
+      </w:pPr>
+      <w:r>
+        <w:rPr>
+          <w:rFonts w:ascii="Aptos Narrow" w:hAnsi="Aptos Narrow" w:cs="Arial"/>
+          <w:color w:val="000000" w:themeColor="text1"/>
+          <w:sz w:val="18"/>
+          <w:szCs w:val="18"/>
+        </w:rPr>
+        <w:t>Translate complex business requirements into clear, robust, and maintainable technical solutions.</w:t>
+      </w:r>
+    </w:p>
+    <w:p>
+      <w:pPr>
+        <w:pStyle w:val="PlainText"/>
+        <w:numPr>
+          <w:ilvl w:val="0"/>
+          <w:numId w:val="36"/>
+        </w:numPr>
+        <w:spacing w:after="200" w:line="276" w:lineRule="auto"/>
+        <w:contextualSpacing/>
+        <w:rPr>
+          <w:rFonts w:ascii="Aptos Narrow" w:hAnsi="Aptos Narrow" w:cs="Arial"/>
+          <w:color w:val="000000" w:themeColor="text1"/>
+          <w:sz w:val="18"/>
+          <w:szCs w:val="18"/>
+        </w:rPr>
+      </w:pPr>
+      <w:r>
+        <w:rPr>
+          <w:rFonts w:ascii="Aptos Narrow" w:hAnsi="Aptos Narrow" w:cs="Arial"/>
+          <w:color w:val="000000" w:themeColor="text1"/>
+          <w:sz w:val="18"/>
+          <w:szCs w:val="18"/>
+        </w:rPr>
+        <w:t>Facilitate effective stakeholder engagement, clarifying technical strategy and ensuring successful project outcomes.</w:t>
+      </w:r>
+    </w:p>
+    <w:p>
+      <w:pPr>
+        <w:pStyle w:val="PlainText"/>
+        <w:numPr>
+          <w:ilvl w:val="0"/>
+          <w:numId w:val="36"/>
+        </w:numPr>
+        <w:spacing w:after="200" w:line="276" w:lineRule="auto"/>
+        <w:contextualSpacing/>
+        <w:rPr>
+          <w:rFonts w:ascii="Aptos Narrow" w:hAnsi="Aptos Narrow" w:cs="Arial"/>
+          <w:color w:val="000000" w:themeColor="text1"/>
+          <w:sz w:val="18"/>
+          <w:szCs w:val="18"/>
+        </w:rPr>
+      </w:pPr>
+      <w:r>
+        <w:rPr>
+          <w:rFonts w:ascii="Aptos Narrow" w:hAnsi="Aptos Narrow" w:cs="Arial"/>
+          <w:color w:val="000000" w:themeColor="text1"/>
+          <w:sz w:val="18"/>
+          <w:szCs w:val="18"/>
+        </w:rPr>
+        <w:t>Drive continuous innovation by integrating cutting-edge cloud technologies and automation frameworks into Recusant's product offerings.</w:t>
+      </w:r>
+    </w:p>
+    <w:p>
+      <w:pPr>
+        <w:pStyle w:val="PlainText"/>
+        <w:numPr>
+          <w:ilvl w:val="0"/>
+          <w:numId w:val="36"/>
+        </w:numPr>
+        <w:spacing w:after="200" w:line="276" w:lineRule="auto"/>
+        <w:contextualSpacing/>
+        <w:rPr>
+          <w:rFonts w:ascii="Aptos Narrow" w:hAnsi="Aptos Narrow" w:cs="Arial"/>
+          <w:color w:val="000000" w:themeColor="text1"/>
+          <w:sz w:val="18"/>
+          <w:szCs w:val="18"/>
+        </w:rPr>
+      </w:pPr>
+      <w:r>
+        <w:rPr>
+          <w:rFonts w:ascii="Aptos Narrow" w:hAnsi="Aptos Narrow" w:cs="Arial"/>
+          <w:color w:val="000000" w:themeColor="text1"/>
+          <w:sz w:val="18"/>
+          <w:szCs w:val="18"/>
+        </w:rPr>
+        <w:lastRenderedPageBreak/>
+        <w:t>Develop and execute tactical marketing plans and strategic positioning, including targeted campaigns, content marketing, and industry engagement to enhance Recusant’s market presence and generate qualified leads.</w:t>
+      </w:r>
+    </w:p>
+    <w:p>
+      <w:pPr>
+        <w:pStyle w:val="PlainText"/>
+        <w:numPr>
+          <w:ilvl w:val="0"/>
+          <w:numId w:val="36"/>
+        </w:numPr>
+        <w:spacing w:after="200" w:line="276" w:lineRule="auto"/>
+        <w:contextualSpacing/>
+        <w:rPr>
+          <w:rFonts w:ascii="Aptos Narrow" w:eastAsia="MS Mincho" w:hAnsi="Aptos Narrow" w:cs="Arial"/>
+          <w:b/>
+          <w:bCs/>
+          <w:sz w:val="18"/>
+          <w:szCs w:val="18"/>
+        </w:rPr>
+      </w:pPr>
+      <w:r>
+        <w:rPr>
+          <w:rFonts w:ascii="Aptos Narrow" w:hAnsi="Aptos Narrow" w:cs="Arial"/>
+          <w:color w:val="000000" w:themeColor="text1"/>
+          <w:sz w:val="18"/>
+          <w:szCs w:val="18"/>
+        </w:rPr>
+        <w:t>Collaborate closely with leadership on marketing strategy to effectively communicate value propositions, strengthen brand identity, and support business development objectives.</w:t>
+      </w:r>
+    </w:p>
+    <w:p>
+      <w:pPr>
+        <w:pStyle w:val="PlainText"/>
+        <w:spacing w:after="200" w:line="276" w:lineRule="auto"/>
+        <w:contextualSpacing/>
+        <w:rPr>
+          <w:rFonts w:ascii="Aptos Narrow" w:eastAsia="MS Mincho" w:hAnsi="Aptos Narrow" w:cs="Arial"/>
+          <w:sz w:val="18"/>
+          <w:szCs w:val="18"/>
+        </w:rPr>
+      </w:pPr>
+      <w:r>
+        <w:rPr>
+          <w:rFonts w:ascii="Aptos Narrow" w:eastAsia="MS Mincho" w:hAnsi="Aptos Narrow" w:cs="Arial"/>
+          <w:sz w:val="18"/>
+          <w:szCs w:val="18"/>
+        </w:rPr>
+        <w:pict w14:anchorId="66CBA543">
+          <v:rect id="_x0000_i1040" style="width:0;height:1.5pt" o:hralign="center" o:hrstd="t" o:hr="t" fillcolor="#a0a0a0" stroked="f"/>
+        </w:pict>
+      </w:r>
+    </w:p>
+    <w:p>
+      <w:pPr>
         <w:spacing w:after="0" w:line="264" w:lineRule="auto"/>
         <w:rPr>
           <w:rFonts w:ascii="Aptos Narrow" w:hAnsi="Aptos Narrow" w:cs="Arial"/>
@@ -2654,31 +3015,7 @@
           <w:sz w:val="18"/>
           <w:szCs w:val="18"/>
         </w:rPr>
-        <w:t xml:space="preserve">Carter </w:t>
-      </w:r>
-      <w:proofErr w:type="spellStart"/>
-      <w:r>
-        <w:rPr>
-          <w:rFonts w:ascii="Aptos Narrow" w:hAnsi="Aptos Narrow" w:cs="Arial"/>
-          <w:b/>
-          <w:bCs/>
-          <w:color w:val="000000" w:themeColor="text1"/>
-          <w:sz w:val="18"/>
-          <w:szCs w:val="18"/>
-        </w:rPr>
-        <w:t>Capner</w:t>
-      </w:r>
-      <w:proofErr w:type="spellEnd"/>
-      <w:r>
-        <w:rPr>
-          <w:rFonts w:ascii="Aptos Narrow" w:hAnsi="Aptos Narrow" w:cs="Arial"/>
-          <w:b/>
-          <w:bCs/>
-          <w:color w:val="000000" w:themeColor="text1"/>
-          <w:sz w:val="18"/>
-          <w:szCs w:val="18"/>
-        </w:rPr>
-        <w:t xml:space="preserve"> Law</w:t>
+        <w:t>Carter Capner Law</w:t>
       </w:r>
       <w:r>
         <w:rPr>
@@ -2866,7 +3203,6 @@
           <w:sz w:val="18"/>
           <w:szCs w:val="18"/>
         </w:rPr>
-        <w:lastRenderedPageBreak/>
         <w:t>Custom App</w:t>
       </w:r>
       <w:r>
@@ -3963,25 +4299,7 @@
           <w:sz w:val="18"/>
           <w:szCs w:val="18"/>
         </w:rPr>
-        <w:t xml:space="preserve">Engaged with clients such as Pharmacy Guild of Australia, Parliament of South Australia, </w:t>
-      </w:r>
-      <w:proofErr w:type="spellStart"/>
-      <w:r>
-        <w:rPr>
-          <w:rFonts w:ascii="Aptos Narrow" w:eastAsia="MS Mincho" w:hAnsi="Aptos Narrow" w:cs="Arial"/>
-          <w:sz w:val="18"/>
-          <w:szCs w:val="18"/>
-        </w:rPr>
-        <w:t>LendLease</w:t>
-      </w:r>
-      <w:proofErr w:type="spellEnd"/>
-      <w:r>
-        <w:rPr>
-          <w:rFonts w:ascii="Aptos Narrow" w:eastAsia="MS Mincho" w:hAnsi="Aptos Narrow" w:cs="Arial"/>
-          <w:sz w:val="18"/>
-          <w:szCs w:val="18"/>
-        </w:rPr>
-        <w:t>, APA Group, and Brisbane City Council</w:t>
+        <w:t>Engaged with clients such as Pharmacy Guild of Australia, Parliament of South Australia, LendLease, APA Group, and Brisbane City Council</w:t>
       </w:r>
       <w:r>
         <w:rPr>
@@ -4127,27 +4445,16 @@
           <w:szCs w:val="18"/>
         </w:rPr>
       </w:pPr>
-      <w:proofErr w:type="spellStart"/>
-      <w:r>
-        <w:rPr>
-          <w:rFonts w:ascii="Aptos Narrow" w:eastAsia="MS Mincho" w:hAnsi="Aptos Narrow" w:cs="Arial"/>
-          <w:b/>
-          <w:bCs/>
-          <w:sz w:val="18"/>
-          <w:szCs w:val="18"/>
-        </w:rPr>
-        <w:t>Symbion</w:t>
-      </w:r>
-      <w:proofErr w:type="spellEnd"/>
-      <w:r>
-        <w:rPr>
-          <w:rFonts w:ascii="Aptos Narrow" w:eastAsia="MS Mincho" w:hAnsi="Aptos Narrow" w:cs="Arial"/>
-          <w:b/>
-          <w:bCs/>
-          <w:sz w:val="18"/>
-          <w:szCs w:val="18"/>
-        </w:rPr>
-        <w:t xml:space="preserve"> Shop</w:t>
+      <w:r>
+        <w:rPr>
+          <w:rFonts w:ascii="Aptos Narrow" w:eastAsia="MS Mincho" w:hAnsi="Aptos Narrow" w:cs="Arial"/>
+          <w:b/>
+          <w:bCs/>
+          <w:sz w:val="18"/>
+          <w:szCs w:val="18"/>
+        </w:rPr>
+        <w:lastRenderedPageBreak/>
+        <w:t>Symbion Shop</w:t>
       </w:r>
       <w:r>
         <w:rPr>
@@ -4529,23 +4836,13 @@
           <w:szCs w:val="18"/>
         </w:rPr>
       </w:pPr>
-      <w:proofErr w:type="spellStart"/>
-      <w:r>
-        <w:rPr>
-          <w:rFonts w:ascii="Aptos Narrow" w:eastAsia="MS Mincho" w:hAnsi="Aptos Narrow" w:cs="Arial"/>
-          <w:sz w:val="18"/>
-          <w:szCs w:val="18"/>
-        </w:rPr>
-        <w:t>EasyVisit</w:t>
-      </w:r>
-      <w:proofErr w:type="spellEnd"/>
-      <w:r>
-        <w:rPr>
-          <w:rFonts w:ascii="Aptos Narrow" w:eastAsia="MS Mincho" w:hAnsi="Aptos Narrow" w:cs="Arial"/>
-          <w:sz w:val="18"/>
-          <w:szCs w:val="18"/>
-        </w:rPr>
-        <w:t xml:space="preserve"> GP appointments platform, supporting 200+ medical centres and 500,000+ bookings in its first year, along with complementary tools like a Check-in Kiosk and Hours Manager</w:t>
+      <w:r>
+        <w:rPr>
+          <w:rFonts w:ascii="Aptos Narrow" w:eastAsia="MS Mincho" w:hAnsi="Aptos Narrow" w:cs="Arial"/>
+          <w:sz w:val="18"/>
+          <w:szCs w:val="18"/>
+        </w:rPr>
+        <w:t>EasyVisit GP appointments platform, supporting 200+ medical centres and 500,000+ bookings in its first year, along with complementary tools like a Check-in Kiosk and Hours Manager</w:t>
       </w:r>
       <w:r>
         <w:rPr>
@@ -4563,20 +4860,8 @@
           <w:sz w:val="18"/>
           <w:szCs w:val="18"/>
         </w:rPr>
-        <w:t xml:space="preserve">.Net Core, Angular, Web API, </w:t>
-      </w:r>
-      <w:proofErr w:type="spellStart"/>
-      <w:r>
-        <w:rPr>
-          <w:rFonts w:ascii="Aptos Narrow" w:eastAsia="MS Mincho" w:hAnsi="Aptos Narrow" w:cs="Arial"/>
-          <w:i/>
-          <w:iCs/>
-          <w:sz w:val="18"/>
-          <w:szCs w:val="18"/>
-        </w:rPr>
-        <w:t>SignalR</w:t>
-      </w:r>
-      <w:proofErr w:type="spellEnd"/>
+        <w:t>.Net Core, Angular, Web API, SignalR</w:t>
+      </w:r>
       <w:r>
         <w:rPr>
           <w:rFonts w:ascii="Aptos Narrow" w:eastAsia="MS Mincho" w:hAnsi="Aptos Narrow" w:cs="Arial"/>
@@ -4711,7 +4996,6 @@
           <w:sz w:val="18"/>
           <w:szCs w:val="18"/>
         </w:rPr>
-        <w:lastRenderedPageBreak/>
         <w:t>Technical Project Manager – R&amp;D, Messaging, and Data Migration</w:t>
       </w:r>
     </w:p>
@@ -4920,7 +5204,6 @@
           <w:szCs w:val="18"/>
         </w:rPr>
       </w:pPr>
-      <w:proofErr w:type="gramStart"/>
       <w:r>
         <w:rPr>
           <w:rFonts w:ascii="Aptos Narrow" w:eastAsia="MS Mincho" w:hAnsi="Aptos Narrow" w:cs="Arial"/>
@@ -4935,16 +5218,7 @@
           <w:sz w:val="18"/>
           <w:szCs w:val="18"/>
         </w:rPr>
-        <w:t>,</w:t>
-      </w:r>
-      <w:proofErr w:type="gramEnd"/>
-      <w:r>
-        <w:rPr>
-          <w:rFonts w:ascii="Aptos Narrow" w:eastAsia="MS Mincho" w:hAnsi="Aptos Narrow" w:cs="Arial"/>
-          <w:sz w:val="18"/>
-          <w:szCs w:val="18"/>
-        </w:rPr>
-        <w:t xml:space="preserve"> </w:t>
+        <w:t xml:space="preserve">, </w:t>
       </w:r>
       <w:r>
         <w:rPr>
@@ -5232,20 +5506,8 @@
           <w:sz w:val="18"/>
           <w:szCs w:val="18"/>
         </w:rPr>
-        <w:t xml:space="preserve">Mobile Apps for </w:t>
-      </w:r>
-      <w:proofErr w:type="spellStart"/>
-      <w:r>
-        <w:rPr>
-          <w:rFonts w:ascii="Aptos Narrow" w:eastAsia="MS Mincho" w:hAnsi="Aptos Narrow" w:cs="Arial"/>
-          <w:b/>
-          <w:bCs/>
-          <w:sz w:val="18"/>
-          <w:szCs w:val="18"/>
-        </w:rPr>
-        <w:t>StatePlus</w:t>
-      </w:r>
-      <w:proofErr w:type="spellEnd"/>
+        <w:t>Mobile Apps for StatePlus</w:t>
+      </w:r>
       <w:r>
         <w:rPr>
           <w:rFonts w:ascii="Aptos Narrow" w:eastAsia="MS Mincho" w:hAnsi="Aptos Narrow" w:cs="Arial"/>
@@ -5518,29 +5780,7 @@
           <w:sz w:val="18"/>
           <w:szCs w:val="18"/>
         </w:rPr>
-        <w:t xml:space="preserve">Product Owner of </w:t>
-      </w:r>
-      <w:proofErr w:type="spellStart"/>
-      <w:r>
-        <w:rPr>
-          <w:rFonts w:ascii="Aptos Narrow" w:eastAsia="MS Mincho" w:hAnsi="Aptos Narrow" w:cs="Arial"/>
-          <w:b/>
-          <w:bCs/>
-          <w:sz w:val="18"/>
-          <w:szCs w:val="18"/>
-        </w:rPr>
-        <w:t>InPlace</w:t>
-      </w:r>
-      <w:proofErr w:type="spellEnd"/>
-      <w:r>
-        <w:rPr>
-          <w:rFonts w:ascii="Aptos Narrow" w:eastAsia="MS Mincho" w:hAnsi="Aptos Narrow" w:cs="Arial"/>
-          <w:b/>
-          <w:bCs/>
-          <w:sz w:val="18"/>
-          <w:szCs w:val="18"/>
-        </w:rPr>
-        <w:t xml:space="preserve"> Software</w:t>
+        <w:t>Product Owner of InPlace Software</w:t>
       </w:r>
       <w:r>
         <w:rPr>
@@ -5864,6 +6104,7 @@
           <w:sz w:val="18"/>
           <w:szCs w:val="18"/>
         </w:rPr>
+        <w:lastRenderedPageBreak/>
         <w:t>Manager, Development &amp; Testing</w:t>
       </w:r>
     </w:p>
@@ -6456,7 +6697,6 @@
           <w:szCs w:val="18"/>
         </w:rPr>
       </w:pPr>
-      <w:proofErr w:type="spellStart"/>
       <w:r>
         <w:rPr>
           <w:rFonts w:ascii="Aptos Narrow" w:eastAsia="MS Mincho" w:hAnsi="Aptos Narrow" w:cs="Arial"/>
@@ -6467,7 +6707,6 @@
         </w:rPr>
         <w:t>MyFuture</w:t>
       </w:r>
-      <w:proofErr w:type="spellEnd"/>
       <w:r>
         <w:rPr>
           <w:rFonts w:ascii="Aptos Narrow" w:eastAsia="MS Mincho" w:hAnsi="Aptos Narrow" w:cs="Arial"/>
@@ -6574,7 +6813,6 @@
           <w:sz w:val="18"/>
           <w:szCs w:val="18"/>
         </w:rPr>
-        <w:lastRenderedPageBreak/>
         <w:t>Software Engineering</w:t>
       </w:r>
       <w:r>
@@ -7441,61 +7679,7 @@
           <w:sz w:val="18"/>
           <w:szCs w:val="18"/>
         </w:rPr>
-        <w:t xml:space="preserve">Managed accounts for high-profile clients including </w:t>
-      </w:r>
-      <w:proofErr w:type="spellStart"/>
-      <w:r>
-        <w:rPr>
-          <w:rFonts w:ascii="Aptos Narrow" w:eastAsia="MS Mincho" w:hAnsi="Aptos Narrow" w:cs="Arial"/>
-          <w:sz w:val="18"/>
-          <w:szCs w:val="18"/>
-        </w:rPr>
-        <w:t>Britax</w:t>
-      </w:r>
-      <w:proofErr w:type="spellEnd"/>
-      <w:r>
-        <w:rPr>
-          <w:rFonts w:ascii="Aptos Narrow" w:eastAsia="MS Mincho" w:hAnsi="Aptos Narrow" w:cs="Arial"/>
-          <w:sz w:val="18"/>
-          <w:szCs w:val="18"/>
-        </w:rPr>
-        <w:t xml:space="preserve">, </w:t>
-      </w:r>
-      <w:proofErr w:type="spellStart"/>
-      <w:r>
-        <w:rPr>
-          <w:rFonts w:ascii="Aptos Narrow" w:eastAsia="MS Mincho" w:hAnsi="Aptos Narrow" w:cs="Arial"/>
-          <w:sz w:val="18"/>
-          <w:szCs w:val="18"/>
-        </w:rPr>
-        <w:t>BlueChipIT</w:t>
-      </w:r>
-      <w:proofErr w:type="spellEnd"/>
-      <w:r>
-        <w:rPr>
-          <w:rFonts w:ascii="Aptos Narrow" w:eastAsia="MS Mincho" w:hAnsi="Aptos Narrow" w:cs="Arial"/>
-          <w:sz w:val="18"/>
-          <w:szCs w:val="18"/>
-        </w:rPr>
-        <w:t xml:space="preserve">, Bob Jane T-Marts, Isuzu, Live Combat Sports, </w:t>
-      </w:r>
-      <w:proofErr w:type="spellStart"/>
-      <w:r>
-        <w:rPr>
-          <w:rFonts w:ascii="Aptos Narrow" w:eastAsia="MS Mincho" w:hAnsi="Aptos Narrow" w:cs="Arial"/>
-          <w:sz w:val="18"/>
-          <w:szCs w:val="18"/>
-        </w:rPr>
-        <w:t>SecureCorp</w:t>
-      </w:r>
-      <w:proofErr w:type="spellEnd"/>
-      <w:r>
-        <w:rPr>
-          <w:rFonts w:ascii="Aptos Narrow" w:eastAsia="MS Mincho" w:hAnsi="Aptos Narrow" w:cs="Arial"/>
-          <w:sz w:val="18"/>
-          <w:szCs w:val="18"/>
-        </w:rPr>
-        <w:t>, and Traffic Technologies.</w:t>
+        <w:t>Managed accounts for high-profile clients including Britax, BlueChipIT, Bob Jane T-Marts, Isuzu, Live Combat Sports, SecureCorp, and Traffic Technologies.</w:t>
       </w:r>
     </w:p>
     <w:p>
@@ -7519,25 +7703,8 @@
           <w:sz w:val="18"/>
           <w:szCs w:val="18"/>
         </w:rPr>
-        <w:t xml:space="preserve">Delivered a </w:t>
-      </w:r>
-      <w:proofErr w:type="gramStart"/>
-      <w:r>
-        <w:rPr>
-          <w:rFonts w:ascii="Aptos Narrow" w:eastAsia="MS Mincho" w:hAnsi="Aptos Narrow" w:cs="Arial"/>
-          <w:sz w:val="18"/>
-          <w:szCs w:val="18"/>
-        </w:rPr>
-        <w:t>websites</w:t>
-      </w:r>
-      <w:proofErr w:type="gramEnd"/>
-      <w:r>
-        <w:rPr>
-          <w:rFonts w:ascii="Aptos Narrow" w:eastAsia="MS Mincho" w:hAnsi="Aptos Narrow" w:cs="Arial"/>
-          <w:sz w:val="18"/>
-          <w:szCs w:val="18"/>
-        </w:rPr>
-        <w:t>, e-commerce solutions, and mobile applications</w:t>
+        <w:lastRenderedPageBreak/>
+        <w:t>Delivered a websites, e-commerce solutions, and mobile applications</w:t>
       </w:r>
       <w:r>
         <w:rPr>
@@ -7579,7 +7746,6 @@
         </w:rPr>
         <w:t xml:space="preserve">modernising their environment from </w:t>
       </w:r>
-      <w:proofErr w:type="gramStart"/>
       <w:r>
         <w:rPr>
           <w:rFonts w:ascii="Aptos Narrow" w:eastAsia="MS Mincho" w:hAnsi="Aptos Narrow" w:cs="Arial"/>
@@ -7588,7 +7754,6 @@
         </w:rPr>
         <w:t>on-premise</w:t>
       </w:r>
-      <w:proofErr w:type="gramEnd"/>
       <w:r>
         <w:rPr>
           <w:rFonts w:ascii="Aptos Narrow" w:eastAsia="MS Mincho" w:hAnsi="Aptos Narrow" w:cs="Arial"/>
@@ -7635,25 +7800,7 @@
           <w:sz w:val="18"/>
           <w:szCs w:val="18"/>
         </w:rPr>
-        <w:t xml:space="preserve">Developed a comprehensive digital platform for </w:t>
-      </w:r>
-      <w:proofErr w:type="spellStart"/>
-      <w:r>
-        <w:rPr>
-          <w:rFonts w:ascii="Aptos Narrow" w:eastAsia="MS Mincho" w:hAnsi="Aptos Narrow" w:cs="Arial"/>
-          <w:sz w:val="18"/>
-          <w:szCs w:val="18"/>
-        </w:rPr>
-        <w:t>BlueChipIT</w:t>
-      </w:r>
-      <w:proofErr w:type="spellEnd"/>
-      <w:r>
-        <w:rPr>
-          <w:rFonts w:ascii="Aptos Narrow" w:eastAsia="MS Mincho" w:hAnsi="Aptos Narrow" w:cs="Arial"/>
-          <w:sz w:val="18"/>
-          <w:szCs w:val="18"/>
-        </w:rPr>
-        <w:t xml:space="preserve">, integrating it with </w:t>
+        <w:t xml:space="preserve">Developed a comprehensive digital platform for BlueChipIT, integrating it with </w:t>
       </w:r>
       <w:r>
         <w:rPr>
@@ -7747,7 +7894,6 @@
           <w:szCs w:val="18"/>
         </w:rPr>
       </w:pPr>
-      <w:proofErr w:type="spellStart"/>
       <w:r>
         <w:rPr>
           <w:rFonts w:ascii="Aptos Narrow" w:eastAsia="MS Mincho" w:hAnsi="Aptos Narrow" w:cs="Arial"/>
@@ -7758,7 +7904,6 @@
         </w:rPr>
         <w:t>SolutionsCorp</w:t>
       </w:r>
-      <w:proofErr w:type="spellEnd"/>
       <w:r>
         <w:rPr>
           <w:rFonts w:ascii="Aptos Narrow" w:eastAsia="MS Mincho" w:hAnsi="Aptos Narrow" w:cs="Arial"/>
@@ -8009,25 +8154,7 @@
           <w:sz w:val="18"/>
           <w:szCs w:val="18"/>
         </w:rPr>
-        <w:t xml:space="preserve">Developed </w:t>
-      </w:r>
-      <w:proofErr w:type="spellStart"/>
-      <w:r>
-        <w:rPr>
-          <w:rFonts w:ascii="Aptos Narrow" w:eastAsia="MS Mincho" w:hAnsi="Aptos Narrow" w:cs="Arial"/>
-          <w:sz w:val="18"/>
-          <w:szCs w:val="18"/>
-        </w:rPr>
-        <w:t>MyDesk</w:t>
-      </w:r>
-      <w:proofErr w:type="spellEnd"/>
-      <w:r>
-        <w:rPr>
-          <w:rFonts w:ascii="Aptos Narrow" w:eastAsia="MS Mincho" w:hAnsi="Aptos Narrow" w:cs="Arial"/>
-          <w:sz w:val="18"/>
-          <w:szCs w:val="18"/>
-        </w:rPr>
-        <w:t xml:space="preserve">, a bespoke CRM tailored to client requirements, </w:t>
+        <w:t xml:space="preserve">Developed MyDesk, a bespoke CRM tailored to client requirements, </w:t>
       </w:r>
       <w:r>
         <w:rPr>
@@ -8085,7 +8212,6 @@
         </w:rPr>
         <w:t xml:space="preserve">with </w:t>
       </w:r>
-      <w:proofErr w:type="spellStart"/>
       <w:r>
         <w:rPr>
           <w:rFonts w:ascii="Aptos Narrow" w:eastAsia="MS Mincho" w:hAnsi="Aptos Narrow" w:cs="Arial"/>
@@ -8094,7 +8220,6 @@
         </w:rPr>
         <w:t>SportzStats</w:t>
       </w:r>
-      <w:proofErr w:type="spellEnd"/>
       <w:r>
         <w:rPr>
           <w:rFonts w:ascii="Aptos Narrow" w:eastAsia="MS Mincho" w:hAnsi="Aptos Narrow" w:cs="Arial"/>
@@ -8161,7 +8286,6 @@
           <w:sz w:val="18"/>
           <w:szCs w:val="18"/>
         </w:rPr>
-        <w:lastRenderedPageBreak/>
         <w:t>Senior Web Developer</w:t>
       </w:r>
     </w:p>
@@ -8352,25 +8476,7 @@
           <w:sz w:val="18"/>
           <w:szCs w:val="18"/>
         </w:rPr>
-        <w:t xml:space="preserve">Built </w:t>
-      </w:r>
-      <w:proofErr w:type="spellStart"/>
-      <w:r>
-        <w:rPr>
-          <w:rFonts w:ascii="Aptos Narrow" w:eastAsia="MS Mincho" w:hAnsi="Aptos Narrow" w:cs="Arial"/>
-          <w:sz w:val="18"/>
-          <w:szCs w:val="18"/>
-        </w:rPr>
-        <w:t>AgentsWeb</w:t>
-      </w:r>
-      <w:proofErr w:type="spellEnd"/>
-      <w:r>
-        <w:rPr>
-          <w:rFonts w:ascii="Aptos Narrow" w:eastAsia="MS Mincho" w:hAnsi="Aptos Narrow" w:cs="Arial"/>
-          <w:sz w:val="18"/>
-          <w:szCs w:val="18"/>
-        </w:rPr>
-        <w:t>, a backend system for property uploads.</w:t>
+        <w:t>Built AgentsWeb, a backend system for property uploads.</w:t>
       </w:r>
     </w:p>
     <w:p>
@@ -8994,27 +9100,15 @@
           <w:szCs w:val="18"/>
         </w:rPr>
       </w:pPr>
-      <w:proofErr w:type="spellStart"/>
-      <w:r>
-        <w:rPr>
-          <w:rFonts w:ascii="Aptos Narrow" w:eastAsia="MS Mincho" w:hAnsi="Aptos Narrow" w:cs="Arial"/>
-          <w:b/>
-          <w:bCs/>
-          <w:sz w:val="18"/>
-          <w:szCs w:val="18"/>
-        </w:rPr>
-        <w:t>DigitalRez</w:t>
-      </w:r>
-      <w:proofErr w:type="spellEnd"/>
-      <w:r>
-        <w:rPr>
-          <w:rFonts w:ascii="Aptos Narrow" w:eastAsia="MS Mincho" w:hAnsi="Aptos Narrow" w:cs="Arial"/>
-          <w:b/>
-          <w:bCs/>
-          <w:sz w:val="18"/>
-          <w:szCs w:val="18"/>
-        </w:rPr>
-        <w:t xml:space="preserve"> Software</w:t>
+      <w:r>
+        <w:rPr>
+          <w:rFonts w:ascii="Aptos Narrow" w:eastAsia="MS Mincho" w:hAnsi="Aptos Narrow" w:cs="Arial"/>
+          <w:b/>
+          <w:bCs/>
+          <w:sz w:val="18"/>
+          <w:szCs w:val="18"/>
+        </w:rPr>
+        <w:t>DigitalRez Software</w:t>
       </w:r>
       <w:r>
         <w:rPr>
@@ -9044,6 +9138,7 @@
           <w:sz w:val="18"/>
           <w:szCs w:val="18"/>
         </w:rPr>
+        <w:lastRenderedPageBreak/>
         <w:t>November 1998 – August 2000</w:t>
       </w:r>
     </w:p>
@@ -11425,6 +11520,92 @@
     </w:lvl>
   </w:abstractNum>
   <w:abstractNum w:abstractNumId="15" w15:restartNumberingAfterBreak="0">
+    <w:nsid w:val="2A535F02"/>
+    <w:multiLevelType w:val="hybridMultilevel"/>
+    <w:tmpl w:val="242E4C26"/>
+    <w:lvl w:ilvl="0" w:tplc="0C09000F">
+      <w:start w:val="1"/>
+      <w:numFmt w:val="decimal"/>
+      <w:lvlText w:val="%1."/>
+      <w:lvlJc w:val="left"/>
+      <w:pPr>
+        <w:ind w:left="720" w:hanging="360"/>
+      </w:pPr>
+    </w:lvl>
+    <w:lvl w:ilvl="1" w:tplc="0C090019" w:tentative="1">
+      <w:start w:val="1"/>
+      <w:numFmt w:val="lowerLetter"/>
+      <w:lvlText w:val="%2."/>
+      <w:lvlJc w:val="left"/>
+      <w:pPr>
+        <w:ind w:left="1440" w:hanging="360"/>
+      </w:pPr>
+    </w:lvl>
+    <w:lvl w:ilvl="2" w:tplc="0C09001B" w:tentative="1">
+      <w:start w:val="1"/>
+      <w:numFmt w:val="lowerRoman"/>
+      <w:lvlText w:val="%3."/>
+      <w:lvlJc w:val="right"/>
+      <w:pPr>
+        <w:ind w:left="2160" w:hanging="180"/>
+      </w:pPr>
+    </w:lvl>
+    <w:lvl w:ilvl="3" w:tplc="0C09000F" w:tentative="1">
+      <w:start w:val="1"/>
+      <w:numFmt w:val="decimal"/>
+      <w:lvlText w:val="%4."/>
+      <w:lvlJc w:val="left"/>
+      <w:pPr>
+        <w:ind w:left="2880" w:hanging="360"/>
+      </w:pPr>
+    </w:lvl>
+    <w:lvl w:ilvl="4" w:tplc="0C090019" w:tentative="1">
+      <w:start w:val="1"/>
+      <w:numFmt w:val="lowerLetter"/>
+      <w:lvlText w:val="%5."/>
+      <w:lvlJc w:val="left"/>
+      <w:pPr>
+        <w:ind w:left="3600" w:hanging="360"/>
+      </w:pPr>
+    </w:lvl>
+    <w:lvl w:ilvl="5" w:tplc="0C09001B" w:tentative="1">
+      <w:start w:val="1"/>
+      <w:numFmt w:val="lowerRoman"/>
+      <w:lvlText w:val="%6."/>
+      <w:lvlJc w:val="right"/>
+      <w:pPr>
+        <w:ind w:left="4320" w:hanging="180"/>
+      </w:pPr>
+    </w:lvl>
+    <w:lvl w:ilvl="6" w:tplc="0C09000F" w:tentative="1">
+      <w:start w:val="1"/>
+      <w:numFmt w:val="decimal"/>
+      <w:lvlText w:val="%7."/>
+      <w:lvlJc w:val="left"/>
+      <w:pPr>
+        <w:ind w:left="5040" w:hanging="360"/>
+      </w:pPr>
+    </w:lvl>
+    <w:lvl w:ilvl="7" w:tplc="0C090019" w:tentative="1">
+      <w:start w:val="1"/>
+      <w:numFmt w:val="lowerLetter"/>
+      <w:lvlText w:val="%8."/>
+      <w:lvlJc w:val="left"/>
+      <w:pPr>
+        <w:ind w:left="5760" w:hanging="360"/>
+      </w:pPr>
+    </w:lvl>
+    <w:lvl w:ilvl="8" w:tplc="0C09001B" w:tentative="1">
+      <w:start w:val="1"/>
+      <w:numFmt w:val="lowerRoman"/>
+      <w:lvlText w:val="%9."/>
+      <w:lvlJc w:val="right"/>
+      <w:pPr>
+        <w:ind w:left="6480" w:hanging="180"/>
+      </w:pPr>
+    </w:lvl>
+  </w:abstractNum>
+  <w:abstractNum w:abstractNumId="16" w15:restartNumberingAfterBreak="0">
     <w:nsid w:val="2B562AA5"/>
     <w:multiLevelType w:val="multilevel"/>
     <w:tmpl w:val="573AA73A"/>
@@ -11573,7 +11754,7 @@
       </w:rPr>
     </w:lvl>
   </w:abstractNum>
-  <w:abstractNum w:abstractNumId="16" w15:restartNumberingAfterBreak="0">
+  <w:abstractNum w:abstractNumId="17" w15:restartNumberingAfterBreak="0">
     <w:nsid w:val="2B727361"/>
     <w:multiLevelType w:val="multilevel"/>
     <w:tmpl w:val="9028EC9A"/>
@@ -11686,7 +11867,7 @@
       </w:pPr>
     </w:lvl>
   </w:abstractNum>
-  <w:abstractNum w:abstractNumId="17" w15:restartNumberingAfterBreak="0">
+  <w:abstractNum w:abstractNumId="18" w15:restartNumberingAfterBreak="0">
     <w:nsid w:val="2BE11489"/>
     <w:multiLevelType w:val="multilevel"/>
     <w:tmpl w:val="1A1860A0"/>
@@ -11835,7 +12016,7 @@
       </w:rPr>
     </w:lvl>
   </w:abstractNum>
-  <w:abstractNum w:abstractNumId="18" w15:restartNumberingAfterBreak="0">
+  <w:abstractNum w:abstractNumId="19" w15:restartNumberingAfterBreak="0">
     <w:nsid w:val="30BD0DF8"/>
     <w:multiLevelType w:val="multilevel"/>
     <w:tmpl w:val="43BE3108"/>
@@ -11984,7 +12165,7 @@
       </w:rPr>
     </w:lvl>
   </w:abstractNum>
-  <w:abstractNum w:abstractNumId="19" w15:restartNumberingAfterBreak="0">
+  <w:abstractNum w:abstractNumId="20" w15:restartNumberingAfterBreak="0">
     <w:nsid w:val="33C2458E"/>
     <w:multiLevelType w:val="multilevel"/>
     <w:tmpl w:val="3A66C16E"/>
@@ -12133,7 +12314,7 @@
       </w:rPr>
     </w:lvl>
   </w:abstractNum>
-  <w:abstractNum w:abstractNumId="20" w15:restartNumberingAfterBreak="0">
+  <w:abstractNum w:abstractNumId="21" w15:restartNumberingAfterBreak="0">
     <w:nsid w:val="37FF5DB5"/>
     <w:multiLevelType w:val="multilevel"/>
     <w:tmpl w:val="4010F368"/>
@@ -12282,7 +12463,7 @@
       </w:rPr>
     </w:lvl>
   </w:abstractNum>
-  <w:abstractNum w:abstractNumId="21" w15:restartNumberingAfterBreak="0">
+  <w:abstractNum w:abstractNumId="22" w15:restartNumberingAfterBreak="0">
     <w:nsid w:val="4093128F"/>
     <w:multiLevelType w:val="multilevel"/>
     <w:tmpl w:val="72A6BA6A"/>
@@ -12431,7 +12612,7 @@
       </w:rPr>
     </w:lvl>
   </w:abstractNum>
-  <w:abstractNum w:abstractNumId="22" w15:restartNumberingAfterBreak="0">
+  <w:abstractNum w:abstractNumId="23" w15:restartNumberingAfterBreak="0">
     <w:nsid w:val="41510AA2"/>
     <w:multiLevelType w:val="multilevel"/>
     <w:tmpl w:val="8BCA6D34"/>
@@ -12580,7 +12761,7 @@
       </w:rPr>
     </w:lvl>
   </w:abstractNum>
-  <w:abstractNum w:abstractNumId="23" w15:restartNumberingAfterBreak="0">
+  <w:abstractNum w:abstractNumId="24" w15:restartNumberingAfterBreak="0">
     <w:nsid w:val="44E5529C"/>
     <w:multiLevelType w:val="hybridMultilevel"/>
     <w:tmpl w:val="B5868BDC"/>
@@ -12696,7 +12877,7 @@
       </w:rPr>
     </w:lvl>
   </w:abstractNum>
-  <w:abstractNum w:abstractNumId="24" w15:restartNumberingAfterBreak="0">
+  <w:abstractNum w:abstractNumId="25" w15:restartNumberingAfterBreak="0">
     <w:nsid w:val="5038454B"/>
     <w:multiLevelType w:val="multilevel"/>
     <w:tmpl w:val="3F5AAB12"/>
@@ -12845,7 +13026,7 @@
       </w:rPr>
     </w:lvl>
   </w:abstractNum>
-  <w:abstractNum w:abstractNumId="25" w15:restartNumberingAfterBreak="0">
+  <w:abstractNum w:abstractNumId="26" w15:restartNumberingAfterBreak="0">
     <w:nsid w:val="52A13B0D"/>
     <w:multiLevelType w:val="multilevel"/>
     <w:tmpl w:val="3F5AAB12"/>
@@ -12994,7 +13175,7 @@
       </w:rPr>
     </w:lvl>
   </w:abstractNum>
-  <w:abstractNum w:abstractNumId="26" w15:restartNumberingAfterBreak="0">
+  <w:abstractNum w:abstractNumId="27" w15:restartNumberingAfterBreak="0">
     <w:nsid w:val="546E39FA"/>
     <w:multiLevelType w:val="multilevel"/>
     <w:tmpl w:val="CBE83602"/>
@@ -13143,7 +13324,7 @@
       </w:rPr>
     </w:lvl>
   </w:abstractNum>
-  <w:abstractNum w:abstractNumId="27" w15:restartNumberingAfterBreak="0">
+  <w:abstractNum w:abstractNumId="28" w15:restartNumberingAfterBreak="0">
     <w:nsid w:val="5B080A67"/>
     <w:multiLevelType w:val="multilevel"/>
     <w:tmpl w:val="8AC89512"/>
@@ -13265,7 +13446,7 @@
       </w:rPr>
     </w:lvl>
   </w:abstractNum>
-  <w:abstractNum w:abstractNumId="28" w15:restartNumberingAfterBreak="0">
+  <w:abstractNum w:abstractNumId="29" w15:restartNumberingAfterBreak="0">
     <w:nsid w:val="66895FF9"/>
     <w:multiLevelType w:val="multilevel"/>
     <w:tmpl w:val="39386666"/>
@@ -13414,7 +13595,7 @@
       </w:rPr>
     </w:lvl>
   </w:abstractNum>
-  <w:abstractNum w:abstractNumId="29" w15:restartNumberingAfterBreak="0">
+  <w:abstractNum w:abstractNumId="30" w15:restartNumberingAfterBreak="0">
     <w:nsid w:val="66B75600"/>
     <w:multiLevelType w:val="singleLevel"/>
     <w:tmpl w:val="B7F0ED64"/>
@@ -13435,7 +13616,7 @@
       </w:rPr>
     </w:lvl>
   </w:abstractNum>
-  <w:abstractNum w:abstractNumId="30" w15:restartNumberingAfterBreak="0">
+  <w:abstractNum w:abstractNumId="31" w15:restartNumberingAfterBreak="0">
     <w:nsid w:val="66BD35CD"/>
     <w:multiLevelType w:val="multilevel"/>
     <w:tmpl w:val="67C20DC6"/>
@@ -13584,7 +13765,120 @@
       </w:rPr>
     </w:lvl>
   </w:abstractNum>
-  <w:abstractNum w:abstractNumId="31" w15:restartNumberingAfterBreak="0">
+  <w:abstractNum w:abstractNumId="32" w15:restartNumberingAfterBreak="0">
+    <w:nsid w:val="6A72756E"/>
+    <w:multiLevelType w:val="hybridMultilevel"/>
+    <w:tmpl w:val="B88C89C2"/>
+    <w:lvl w:ilvl="0" w:tplc="0C090001">
+      <w:start w:val="1"/>
+      <w:numFmt w:val="bullet"/>
+      <w:lvlText w:val=""/>
+      <w:lvlJc w:val="left"/>
+      <w:pPr>
+        <w:ind w:left="720" w:hanging="360"/>
+      </w:pPr>
+      <w:rPr>
+        <w:rFonts w:ascii="Symbol" w:hAnsi="Symbol" w:hint="default"/>
+      </w:rPr>
+    </w:lvl>
+    <w:lvl w:ilvl="1" w:tplc="0C090003" w:tentative="1">
+      <w:start w:val="1"/>
+      <w:numFmt w:val="bullet"/>
+      <w:lvlText w:val="o"/>
+      <w:lvlJc w:val="left"/>
+      <w:pPr>
+        <w:ind w:left="1440" w:hanging="360"/>
+      </w:pPr>
+      <w:rPr>
+        <w:rFonts w:ascii="Courier New" w:hAnsi="Courier New" w:cs="Courier New" w:hint="default"/>
+      </w:rPr>
+    </w:lvl>
+    <w:lvl w:ilvl="2" w:tplc="0C090005" w:tentative="1">
+      <w:start w:val="1"/>
+      <w:numFmt w:val="bullet"/>
+      <w:lvlText w:val=""/>
+      <w:lvlJc w:val="left"/>
+      <w:pPr>
+        <w:ind w:left="2160" w:hanging="360"/>
+      </w:pPr>
+      <w:rPr>
+        <w:rFonts w:ascii="Wingdings" w:hAnsi="Wingdings" w:hint="default"/>
+      </w:rPr>
+    </w:lvl>
+    <w:lvl w:ilvl="3" w:tplc="0C090001" w:tentative="1">
+      <w:start w:val="1"/>
+      <w:numFmt w:val="bullet"/>
+      <w:lvlText w:val=""/>
+      <w:lvlJc w:val="left"/>
+      <w:pPr>
+        <w:ind w:left="2880" w:hanging="360"/>
+      </w:pPr>
+      <w:rPr>
+        <w:rFonts w:ascii="Symbol" w:hAnsi="Symbol" w:hint="default"/>
+      </w:rPr>
+    </w:lvl>
+    <w:lvl w:ilvl="4" w:tplc="0C090003" w:tentative="1">
+      <w:start w:val="1"/>
+      <w:numFmt w:val="bullet"/>
+      <w:lvlText w:val="o"/>
+      <w:lvlJc w:val="left"/>
+      <w:pPr>
+        <w:ind w:left="3600" w:hanging="360"/>
+      </w:pPr>
+      <w:rPr>
+        <w:rFonts w:ascii="Courier New" w:hAnsi="Courier New" w:cs="Courier New" w:hint="default"/>
+      </w:rPr>
+    </w:lvl>
+    <w:lvl w:ilvl="5" w:tplc="0C090005" w:tentative="1">
+      <w:start w:val="1"/>
+      <w:numFmt w:val="bullet"/>
+      <w:lvlText w:val=""/>
+      <w:lvlJc w:val="left"/>
+      <w:pPr>
+        <w:ind w:left="4320" w:hanging="360"/>
+      </w:pPr>
+      <w:rPr>
+        <w:rFonts w:ascii="Wingdings" w:hAnsi="Wingdings" w:hint="default"/>
+      </w:rPr>
+    </w:lvl>
+    <w:lvl w:ilvl="6" w:tplc="0C090001" w:tentative="1">
+      <w:start w:val="1"/>
+      <w:numFmt w:val="bullet"/>
+      <w:lvlText w:val=""/>
+      <w:lvlJc w:val="left"/>
+      <w:pPr>
+        <w:ind w:left="5040" w:hanging="360"/>
+      </w:pPr>
+      <w:rPr>
+        <w:rFonts w:ascii="Symbol" w:hAnsi="Symbol" w:hint="default"/>
+      </w:rPr>
+    </w:lvl>
+    <w:lvl w:ilvl="7" w:tplc="0C090003" w:tentative="1">
+      <w:start w:val="1"/>
+      <w:numFmt w:val="bullet"/>
+      <w:lvlText w:val="o"/>
+      <w:lvlJc w:val="left"/>
+      <w:pPr>
+        <w:ind w:left="5760" w:hanging="360"/>
+      </w:pPr>
+      <w:rPr>
+        <w:rFonts w:ascii="Courier New" w:hAnsi="Courier New" w:cs="Courier New" w:hint="default"/>
+      </w:rPr>
+    </w:lvl>
+    <w:lvl w:ilvl="8" w:tplc="0C090005" w:tentative="1">
+      <w:start w:val="1"/>
+      <w:numFmt w:val="bullet"/>
+      <w:lvlText w:val=""/>
+      <w:lvlJc w:val="left"/>
+      <w:pPr>
+        <w:ind w:left="6480" w:hanging="360"/>
+      </w:pPr>
+      <w:rPr>
+        <w:rFonts w:ascii="Wingdings" w:hAnsi="Wingdings" w:hint="default"/>
+      </w:rPr>
+    </w:lvl>
+  </w:abstractNum>
+  <w:abstractNum w:abstractNumId="33" w15:restartNumberingAfterBreak="0">
     <w:nsid w:val="6FA01851"/>
     <w:multiLevelType w:val="multilevel"/>
     <w:tmpl w:val="0066930E"/>
@@ -13733,7 +14027,96 @@
       </w:rPr>
     </w:lvl>
   </w:abstractNum>
-  <w:abstractNum w:abstractNumId="32" w15:restartNumberingAfterBreak="0">
+  <w:abstractNum w:abstractNumId="34" w15:restartNumberingAfterBreak="0">
+    <w:nsid w:val="74DF71BD"/>
+    <w:multiLevelType w:val="hybridMultilevel"/>
+    <w:tmpl w:val="02688E50"/>
+    <w:lvl w:ilvl="0" w:tplc="0C090001">
+      <w:start w:val="1"/>
+      <w:numFmt w:val="bullet"/>
+      <w:lvlText w:val=""/>
+      <w:lvlJc w:val="left"/>
+      <w:pPr>
+        <w:ind w:left="720" w:hanging="360"/>
+      </w:pPr>
+      <w:rPr>
+        <w:rFonts w:ascii="Symbol" w:hAnsi="Symbol" w:hint="default"/>
+      </w:rPr>
+    </w:lvl>
+    <w:lvl w:ilvl="1" w:tplc="FFFFFFFF" w:tentative="1">
+      <w:start w:val="1"/>
+      <w:numFmt w:val="lowerLetter"/>
+      <w:lvlText w:val="%2."/>
+      <w:lvlJc w:val="left"/>
+      <w:pPr>
+        <w:ind w:left="1440" w:hanging="360"/>
+      </w:pPr>
+    </w:lvl>
+    <w:lvl w:ilvl="2" w:tplc="FFFFFFFF" w:tentative="1">
+      <w:start w:val="1"/>
+      <w:numFmt w:val="lowerRoman"/>
+      <w:lvlText w:val="%3."/>
+      <w:lvlJc w:val="right"/>
+      <w:pPr>
+        <w:ind w:left="2160" w:hanging="180"/>
+      </w:pPr>
+    </w:lvl>
+    <w:lvl w:ilvl="3" w:tplc="FFFFFFFF" w:tentative="1">
+      <w:start w:val="1"/>
+      <w:numFmt w:val="decimal"/>
+      <w:lvlText w:val="%4."/>
+      <w:lvlJc w:val="left"/>
+      <w:pPr>
+        <w:ind w:left="2880" w:hanging="360"/>
+      </w:pPr>
+    </w:lvl>
+    <w:lvl w:ilvl="4" w:tplc="FFFFFFFF" w:tentative="1">
+      <w:start w:val="1"/>
+      <w:numFmt w:val="lowerLetter"/>
+      <w:lvlText w:val="%5."/>
+      <w:lvlJc w:val="left"/>
+      <w:pPr>
+        <w:ind w:left="3600" w:hanging="360"/>
+      </w:pPr>
+    </w:lvl>
+    <w:lvl w:ilvl="5" w:tplc="FFFFFFFF" w:tentative="1">
+      <w:start w:val="1"/>
+      <w:numFmt w:val="lowerRoman"/>
+      <w:lvlText w:val="%6."/>
+      <w:lvlJc w:val="right"/>
+      <w:pPr>
+        <w:ind w:left="4320" w:hanging="180"/>
+      </w:pPr>
+    </w:lvl>
+    <w:lvl w:ilvl="6" w:tplc="FFFFFFFF" w:tentative="1">
+      <w:start w:val="1"/>
+      <w:numFmt w:val="decimal"/>
+      <w:lvlText w:val="%7."/>
+      <w:lvlJc w:val="left"/>
+      <w:pPr>
+        <w:ind w:left="5040" w:hanging="360"/>
+      </w:pPr>
+    </w:lvl>
+    <w:lvl w:ilvl="7" w:tplc="FFFFFFFF" w:tentative="1">
+      <w:start w:val="1"/>
+      <w:numFmt w:val="lowerLetter"/>
+      <w:lvlText w:val="%8."/>
+      <w:lvlJc w:val="left"/>
+      <w:pPr>
+        <w:ind w:left="5760" w:hanging="360"/>
+      </w:pPr>
+    </w:lvl>
+    <w:lvl w:ilvl="8" w:tplc="FFFFFFFF" w:tentative="1">
+      <w:start w:val="1"/>
+      <w:numFmt w:val="lowerRoman"/>
+      <w:lvlText w:val="%9."/>
+      <w:lvlJc w:val="right"/>
+      <w:pPr>
+        <w:ind w:left="6480" w:hanging="180"/>
+      </w:pPr>
+    </w:lvl>
+  </w:abstractNum>
+  <w:abstractNum w:abstractNumId="35" w15:restartNumberingAfterBreak="0">
     <w:nsid w:val="7F790ABB"/>
     <w:multiLevelType w:val="multilevel"/>
     <w:tmpl w:val="B0706766"/>
@@ -13883,46 +14266,46 @@
     </w:lvl>
   </w:abstractNum>
   <w:num w:numId="1" w16cid:durableId="1785343581">
-    <w:abstractNumId w:val="29"/>
+    <w:abstractNumId w:val="30"/>
   </w:num>
   <w:num w:numId="2" w16cid:durableId="665324747">
-    <w:abstractNumId w:val="27"/>
+    <w:abstractNumId w:val="28"/>
   </w:num>
   <w:num w:numId="3" w16cid:durableId="2105761701">
-    <w:abstractNumId w:val="23"/>
+    <w:abstractNumId w:val="24"/>
   </w:num>
   <w:num w:numId="4" w16cid:durableId="2060199216">
     <w:abstractNumId w:val="0"/>
   </w:num>
   <w:num w:numId="5" w16cid:durableId="272716562">
-    <w:abstractNumId w:val="19"/>
+    <w:abstractNumId w:val="20"/>
   </w:num>
   <w:num w:numId="6" w16cid:durableId="6760380">
     <w:abstractNumId w:val="1"/>
   </w:num>
   <w:num w:numId="7" w16cid:durableId="1876041239">
-    <w:abstractNumId w:val="30"/>
+    <w:abstractNumId w:val="31"/>
   </w:num>
   <w:num w:numId="8" w16cid:durableId="2108888128">
     <w:abstractNumId w:val="11"/>
   </w:num>
   <w:num w:numId="9" w16cid:durableId="710691315">
-    <w:abstractNumId w:val="32"/>
+    <w:abstractNumId w:val="35"/>
   </w:num>
   <w:num w:numId="10" w16cid:durableId="989945359">
-    <w:abstractNumId w:val="20"/>
+    <w:abstractNumId w:val="21"/>
   </w:num>
   <w:num w:numId="11" w16cid:durableId="896863403">
-    <w:abstractNumId w:val="17"/>
+    <w:abstractNumId w:val="18"/>
   </w:num>
   <w:num w:numId="12" w16cid:durableId="373116302">
-    <w:abstractNumId w:val="21"/>
+    <w:abstractNumId w:val="22"/>
   </w:num>
   <w:num w:numId="13" w16cid:durableId="2049602650">
     <w:abstractNumId w:val="7"/>
   </w:num>
   <w:num w:numId="14" w16cid:durableId="2115706578">
-    <w:abstractNumId w:val="31"/>
+    <w:abstractNumId w:val="33"/>
   </w:num>
   <w:num w:numId="15" w16cid:durableId="1673293457">
     <w:abstractNumId w:val="10"/>
@@ -13937,13 +14320,13 @@
     <w:abstractNumId w:val="9"/>
   </w:num>
   <w:num w:numId="19" w16cid:durableId="638727657">
-    <w:abstractNumId w:val="26"/>
+    <w:abstractNumId w:val="27"/>
   </w:num>
   <w:num w:numId="20" w16cid:durableId="520750274">
     <w:abstractNumId w:val="3"/>
   </w:num>
   <w:num w:numId="21" w16cid:durableId="558248591">
-    <w:abstractNumId w:val="16"/>
+    <w:abstractNumId w:val="17"/>
   </w:num>
   <w:num w:numId="22" w16cid:durableId="984239418">
     <w:abstractNumId w:val="6"/>
@@ -13958,28 +14341,37 @@
     <w:abstractNumId w:val="12"/>
   </w:num>
   <w:num w:numId="26" w16cid:durableId="1682660921">
-    <w:abstractNumId w:val="28"/>
+    <w:abstractNumId w:val="29"/>
   </w:num>
   <w:num w:numId="27" w16cid:durableId="1782144591">
     <w:abstractNumId w:val="8"/>
   </w:num>
   <w:num w:numId="28" w16cid:durableId="1950117319">
-    <w:abstractNumId w:val="15"/>
+    <w:abstractNumId w:val="16"/>
   </w:num>
   <w:num w:numId="29" w16cid:durableId="980353169">
-    <w:abstractNumId w:val="18"/>
+    <w:abstractNumId w:val="19"/>
   </w:num>
   <w:num w:numId="30" w16cid:durableId="1007514199">
-    <w:abstractNumId w:val="25"/>
+    <w:abstractNumId w:val="26"/>
   </w:num>
   <w:num w:numId="31" w16cid:durableId="1633749370">
-    <w:abstractNumId w:val="24"/>
+    <w:abstractNumId w:val="25"/>
   </w:num>
   <w:num w:numId="32" w16cid:durableId="1638991782">
     <w:abstractNumId w:val="14"/>
   </w:num>
   <w:num w:numId="33" w16cid:durableId="599993371">
-    <w:abstractNumId w:val="22"/>
+    <w:abstractNumId w:val="23"/>
+  </w:num>
+  <w:num w:numId="34" w16cid:durableId="1951276021">
+    <w:abstractNumId w:val="15"/>
+  </w:num>
+  <w:num w:numId="35" w16cid:durableId="951983445">
+    <w:abstractNumId w:val="34"/>
+  </w:num>
+  <w:num w:numId="36" w16cid:durableId="576985475">
+    <w:abstractNumId w:val="32"/>
   </w:num>
   <w:numIdMacAtCleanup w:val="22"/>
 </w:numbering>
@@ -14587,7 +14979,6 @@
   <w:style w:type="character" w:default="1" w:styleId="DefaultParagraphFont">
     <w:name w:val="Default Paragraph Font"/>
     <w:uiPriority w:val="1"/>
-    <w:semiHidden/>
     <w:unhideWhenUsed/>
   </w:style>
   <w:style w:type="table" w:default="1" w:styleId="TableNormal">

</xml_diff>